<commit_message>
Spelersdata: 585 echte spelers op 74 profclubs in players.json (naam, nummer, positie, huid, haar, kapsel, schoenen) + uiterlijk-ondersteuning in de match en uitgebreide testhooks
</commit_message>
<xml_diff>
--- a/EAWG-Mobile-overdracht-v3.docx
+++ b/EAWG-Mobile-overdracht-v3.docx
@@ -295,6 +295,46 @@
     <w:p>
       <w:r>
         <w:t>De game draait lokaal op http://127.0.0.1:4871 (python http.server in de map public, gestart tijdens deze sessie). Herstarten kan met een terminal in die map: python -m http.server 4871.</w:t>
+      </w:r>
+    </w:p>
+    <w:p>
+      <w:pPr>
+        <w:pStyle w:val="Heading1"/>
+      </w:pPr>
+      <w:r>
+        <w:t>7. Spelers en uiterlijk (nachtelijke toevoeging)</w:t>
+      </w:r>
+    </w:p>
+    <w:p>
+      <w:pPr>
+        <w:pStyle w:val="ListBullet"/>
+      </w:pPr>
+      <w:r>
+        <w:t>players.json bestaat nu echt: 585 echte spelers over 74 profclubs (Pro League, Eredivisie, Premier League, Bundesliga), met rugnummer, positie en uiterlijk (huidtint 0-4, haarkleur 0-4, kapsel 0-3, schoenkleur 0-5). Samengesteld door vier onderzoekers uit publieke squadlijsten; schattingen bij huid/haar zijn benaderd en per speler te corrigeren in tools/selecties/*.json + python tools/merge_spelers.py.</w:t>
+      </w:r>
+    </w:p>
+    <w:p>
+      <w:pPr>
+        <w:pStyle w:val="ListBullet"/>
+      </w:pPr>
+      <w:r>
+        <w:t>De 24 West-Vlaamse amateurclubs bewust GEEN echte spelersnamen gegeven (GDPR-beslissing uit hoofdstuk 5); daar blijven de verzonnen namen.</w:t>
+      </w:r>
+    </w:p>
+    <w:p>
+      <w:pPr>
+        <w:pStyle w:val="ListBullet"/>
+      </w:pPr>
+      <w:r>
+        <w:t>De game leest players.json automatisch (fetch na 0,4 s); ontbreekt het bestand, dan de ingebouwde namen.</w:t>
+      </w:r>
+    </w:p>
+    <w:p>
+      <w:pPr>
+        <w:pStyle w:val="ListBullet"/>
+      </w:pPr>
+      <w:r>
+        <w:t>Testhooks uitgebreid: window.__eawg.names(), .pj (aantal clubs geladen) en .vriendelijk(a,b) om twee clubs uit de alfabetische lijst direct tegen elkaar te zetten.</w:t>
       </w:r>
     </w:p>
     <w:sectPr>

</xml_diff>